<commit_message>
Durably restage corrected Manual 06 publication package
</commit_message>
<xml_diff>
--- a/04-regulatory-compliance/HIPAA_Implementation_Series/publication/Manual_06_HIPAA_Implementation_and_Audit_ES-419.docx
+++ b/04-regulatory-compliance/HIPAA_Implementation_Series/publication/Manual_06_HIPAA_Implementation_and_Audit_ES-419.docx
@@ -41,7 +41,7 @@
           <w:sz w:val="17"/>
           <w:lang w:val="es-419"/>
         </w:rPr>
-        <w:t>Controlled source revision: 152d9d8520d40aab269e7760c73ea096e7ea90b6 | Idioma: es-419 | current-law/proposed-rule source-state controls retained.</w:t>
+        <w:t>Revisión de fuente controlada: c4c1ecef7f19c72de42b2589c9d69c18e0f0647a | Idioma: es-419 | se conservan los controles de estado de fuentes de normativa vigente y regla propuesta.</w:t>
       </w:r>
     </w:p>
     <w:p>
@@ -554,7 +554,7 @@
           <w:rFonts w:ascii="Arial" w:hAnsi="Arial" w:eastAsia="Arial"/>
           <w:lang w:val="es-419"/>
         </w:rPr>
-        <w:t>Figure 1. Implementation memory graphic</w:t>
+        <w:t>Figura 1. Gráfico de memoria de implementación de HIPAA</w:t>
       </w:r>
     </w:p>
     <w:p>
@@ -642,7 +642,7 @@
           <w:rFonts w:ascii="Arial" w:hAnsi="Arial" w:eastAsia="Arial"/>
           <w:lang w:val="es-419"/>
         </w:rPr>
-        <w:t>Figure 2. Implementation memory graphic</w:t>
+        <w:t>Figura 2. Gráfico de memoria de implementación de HIPAA</w:t>
       </w:r>
     </w:p>
     <w:p>
@@ -730,7 +730,7 @@
           <w:rFonts w:ascii="Arial" w:hAnsi="Arial" w:eastAsia="Arial"/>
           <w:lang w:val="es-419"/>
         </w:rPr>
-        <w:t>Figure 3. Implementation memory graphic</w:t>
+        <w:t>Figura 3. Gráfico de memoria de implementación de HIPAA</w:t>
       </w:r>
     </w:p>
     <w:p>

</xml_diff>